<commit_message>
docs: prepare external Microsoft emoji review packet
</commit_message>
<xml_diff>
--- a/output/doc/2026-07-12-microsoft-medical-emoji-decision-brief.docx
+++ b/output/doc/2026-07-12-microsoft-medical-emoji-decision-brief.docx
@@ -11,9 +11,89 @@
           <w:rFonts w:ascii="Segoe UI" w:hAnsi="Segoe UI" w:eastAsia="Segoe UI"/>
           <w:b w:val="0"/>
           <w:color w:val="0B1739"/>
-          <w:sz w:val="17"/>
+          <w:sz w:val="18"/>
         </w:rPr>
-        <w:t>2026 Medical Emoji: Microsoft Internal Decision Brief</w:t>
+        <w:t>Medical Emoji proposals for Microsoft review</w:t>
+      </w:r>
+    </w:p>
+    <w:tbl>
+      <w:tblPr>
+        <w:tblW w:type="auto" w:w="0"/>
+        <w:tblLayout w:type="fixed"/>
+        <w:tblLook w:firstColumn="1" w:firstRow="1" w:lastColumn="0" w:lastRow="0" w:noHBand="0" w:noVBand="1" w:val="04A0"/>
+      </w:tblPr>
+      <w:tblGrid>
+        <w:gridCol w:w="10584"/>
+      </w:tblGrid>
+      <w:tr>
+        <w:tc>
+          <w:tcPr>
+            <w:tcW w:type="dxa" w:w="10570"/>
+            <w:shd w:val="clear" w:fill="EAF1FF"/>
+          </w:tcPr>
+          <w:p>
+            <w:pPr>
+              <w:spacing w:after="0"/>
+            </w:pPr>
+            <w:r>
+              <w:rPr>
+                <w:rFonts w:ascii="Segoe UI" w:hAnsi="Segoe UI" w:eastAsia="Segoe UI"/>
+                <w:b w:val="0"/>
+                <w:color w:val="667085"/>
+                <w:sz w:val="15"/>
+              </w:rPr>
+              <w:t>Prepared: July 13, 2026</w:t>
+            </w:r>
+            <w:r>
+              <w:rPr>
+                <w:rFonts w:ascii="Segoe UI" w:hAnsi="Segoe UI" w:eastAsia="Segoe UI"/>
+                <w:color w:val="667085"/>
+                <w:sz w:val="15"/>
+              </w:rPr>
+              <w:br/>
+            </w:r>
+            <w:r>
+              <w:rPr>
+                <w:rFonts w:ascii="Segoe UI" w:hAnsi="Segoe UI" w:eastAsia="Segoe UI"/>
+                <w:b w:val="0"/>
+                <w:color w:val="667085"/>
+                <w:sz w:val="15"/>
+              </w:rPr>
+              <w:t>Prepared by: Shuhan He</w:t>
+            </w:r>
+            <w:r>
+              <w:rPr>
+                <w:rFonts w:ascii="Segoe UI" w:hAnsi="Segoe UI" w:eastAsia="Segoe UI"/>
+                <w:color w:val="667085"/>
+                <w:sz w:val="15"/>
+              </w:rPr>
+              <w:br/>
+            </w:r>
+            <w:r>
+              <w:rPr>
+                <w:rFonts w:ascii="Segoe UI" w:hAnsi="Segoe UI" w:eastAsia="Segoe UI"/>
+                <w:b w:val="0"/>
+                <w:color w:val="667085"/>
+                <w:sz w:val="15"/>
+              </w:rPr>
+              <w:t>Status: Prepared independently for discussion. Microsoft has not endorsed these proposals or committed to implement them.</w:t>
+            </w:r>
+          </w:p>
+        </w:tc>
+      </w:tr>
+    </w:tbl>
+    <w:p>
+      <w:pPr>
+        <w:pStyle w:val="Heading2"/>
+      </w:pPr>
+      <w:r>
+        <w:rPr>
+          <w:rFonts w:ascii="Segoe UI" w:hAnsi="Segoe UI" w:eastAsia="Segoe UI"/>
+          <w:b w:val="0"/>
+          <w:color w:val="0B1739"/>
+          <w:sz w:val="18"/>
+        </w:rPr>
+        <w:t>Purpose</w:t>
       </w:r>
     </w:p>
     <w:p>
@@ -22,9 +102,63 @@
           <w:rFonts w:ascii="Segoe UI" w:hAnsi="Segoe UI" w:eastAsia="Segoe UI"/>
           <w:b w:val="0"/>
           <w:color w:val="0B1739"/>
-          <w:sz w:val="17"/>
+          <w:sz w:val="18"/>
         </w:rPr>
-        <w:t>Prepared: July 12, 2026</w:t>
+        <w:t xml:space="preserve">I plan to submit </w:t>
+      </w:r>
+      <w:r>
+        <w:rPr>
+          <w:rFonts w:ascii="Segoe UI" w:hAnsi="Segoe UI" w:eastAsia="Segoe UI"/>
+          <w:b/>
+          <w:color w:val="0B1739"/>
+          <w:sz w:val="18"/>
+        </w:rPr>
+        <w:t>CT Scan</w:t>
+      </w:r>
+      <w:r>
+        <w:rPr>
+          <w:rFonts w:ascii="Segoe UI" w:hAnsi="Segoe UI" w:eastAsia="Segoe UI"/>
+          <w:b w:val="0"/>
+          <w:color w:val="0B1739"/>
+          <w:sz w:val="18"/>
+        </w:rPr>
+        <w:t xml:space="preserve"> and </w:t>
+      </w:r>
+      <w:r>
+        <w:rPr>
+          <w:rFonts w:ascii="Segoe UI" w:hAnsi="Segoe UI" w:eastAsia="Segoe UI"/>
+          <w:b/>
+          <w:color w:val="0B1739"/>
+          <w:sz w:val="18"/>
+        </w:rPr>
+        <w:t>Blood Bag</w:t>
+      </w:r>
+      <w:r>
+        <w:rPr>
+          <w:rFonts w:ascii="Segoe UI" w:hAnsi="Segoe UI" w:eastAsia="Segoe UI"/>
+          <w:b w:val="0"/>
+          <w:color w:val="0B1739"/>
+          <w:sz w:val="18"/>
+        </w:rPr>
+        <w:t xml:space="preserve"> through Unicode's 2026 emoji intake after updating their evidence and image-rights language. </w:t>
+      </w:r>
+      <w:r>
+        <w:rPr>
+          <w:rFonts w:ascii="Segoe UI" w:hAnsi="Segoe UI" w:eastAsia="Segoe UI"/>
+          <w:b/>
+          <w:color w:val="0B1739"/>
+          <w:sz w:val="18"/>
+        </w:rPr>
+        <w:t>Pill Box</w:t>
+      </w:r>
+      <w:r>
+        <w:rPr>
+          <w:rFonts w:ascii="Segoe UI" w:hAnsi="Segoe UI" w:eastAsia="Segoe UI"/>
+          <w:b w:val="0"/>
+          <w:color w:val="0B1739"/>
+          <w:sz w:val="18"/>
+        </w:rPr>
+        <w:t xml:space="preserve"> is the first alternate. Unicode's published filing window closes July 31. That places this work late in the cycle, but still before the deadline.</w:t>
       </w:r>
     </w:p>
     <w:p>
@@ -33,20 +167,37 @@
           <w:rFonts w:ascii="Segoe UI" w:hAnsi="Segoe UI" w:eastAsia="Segoe UI"/>
           <w:b w:val="0"/>
           <w:color w:val="0B1739"/>
-          <w:sz w:val="17"/>
+          <w:sz w:val="18"/>
         </w:rPr>
-        <w:t>Prepared by: Shuhan He</w:t>
+        <w:t>This brief asks Microsoft for two kinds of help:</w:t>
       </w:r>
     </w:p>
     <w:p>
+      <w:pPr>
+        <w:pStyle w:val="ListNumber"/>
+      </w:pPr>
       <w:r>
         <w:rPr>
           <w:rFonts w:ascii="Segoe UI" w:hAnsi="Segoe UI" w:eastAsia="Segoe UI"/>
           <w:b w:val="0"/>
           <w:color w:val="0B1739"/>
-          <w:sz w:val="17"/>
+          <w:sz w:val="18"/>
         </w:rPr>
-        <w:t>Status: Internal review draft. This document does not represent Microsoft sponsorship, approval, or an implementation commitment.</w:t>
+        <w:t>Review the proposal shortlist, artwork, evidence, and rights record.</w:t>
+      </w:r>
+    </w:p>
+    <w:p>
+      <w:pPr>
+        <w:pStyle w:val="ListNumber"/>
+      </w:pPr>
+      <w:r>
+        <w:rPr>
+          <w:rFonts w:ascii="Segoe UI" w:hAnsi="Segoe UI" w:eastAsia="Segoe UI"/>
+          <w:b w:val="0"/>
+          <w:color w:val="0B1739"/>
+          <w:sz w:val="18"/>
+        </w:rPr>
+        <w:t>Advise on the appropriate Unicode route for the individual proposals and for a separate discussion document about health-related emoji coverage.</w:t>
       </w:r>
     </w:p>
     <w:p>
@@ -58,9 +209,69 @@
           <w:rFonts w:ascii="Segoe UI" w:hAnsi="Segoe UI" w:eastAsia="Segoe UI"/>
           <w:b w:val="0"/>
           <w:color w:val="0B1739"/>
-          <w:sz w:val="17"/>
+          <w:sz w:val="18"/>
         </w:rPr>
-        <w:t>Decision requested</w:t>
+        <w:t>Current filing plan</w:t>
+      </w:r>
+    </w:p>
+    <w:p>
+      <w:r>
+        <w:rPr>
+          <w:rFonts w:ascii="Segoe UI" w:hAnsi="Segoe UI" w:eastAsia="Segoe UI"/>
+          <w:b/>
+          <w:color w:val="0B1739"/>
+          <w:sz w:val="18"/>
+        </w:rPr>
+        <w:t>CT Scan.</w:t>
+      </w:r>
+      <w:r>
+        <w:rPr>
+          <w:rFonts w:ascii="Segoe UI" w:hAnsi="Segoe UI" w:eastAsia="Segoe UI"/>
+          <w:b w:val="0"/>
+          <w:color w:val="0B1739"/>
+          <w:sz w:val="18"/>
+        </w:rPr>
+        <w:t xml:space="preserve"> This is the strongest developed proposal. It includes exhibits in all five evidence categories and has a clearer independent use case than the existing X-Ray emoji. Before filing, I will recapture its 2020 Search, Video, and Trends evidence using the current method, test the 18-pixel image against MRI and generic scanners, and state the artwork ownership clearly.</w:t>
+      </w:r>
+    </w:p>
+    <w:p>
+      <w:r>
+        <w:rPr>
+          <w:rFonts w:ascii="Segoe UI" w:hAnsi="Segoe UI" w:eastAsia="Segoe UI"/>
+          <w:b/>
+          <w:color w:val="0B1739"/>
+          <w:sz w:val="18"/>
+        </w:rPr>
+        <w:t>Blood Bag.</w:t>
+      </w:r>
+      <w:r>
+        <w:rPr>
+          <w:rFonts w:ascii="Segoe UI" w:hAnsi="Segoe UI" w:eastAsia="Segoe UI"/>
+          <w:b w:val="0"/>
+          <w:color w:val="0B1739"/>
+          <w:sz w:val="18"/>
+        </w:rPr>
+        <w:t xml:space="preserve"> This proposal also includes the five required evidence exhibits. It supports donation, transfusion, blood-supply, and patient-care communication that a Drop of Blood cannot fully express. I will refresh the 2020 evidence and test the image beside IV Bag because the two silhouettes are similar in black and white.</w:t>
+      </w:r>
+    </w:p>
+    <w:p>
+      <w:r>
+        <w:rPr>
+          <w:rFonts w:ascii="Segoe UI" w:hAnsi="Segoe UI" w:eastAsia="Segoe UI"/>
+          <w:b/>
+          <w:color w:val="0B1739"/>
+          <w:sz w:val="18"/>
+        </w:rPr>
+        <w:t>Pill Box, as the first alternate.</w:t>
+      </w:r>
+      <w:r>
+        <w:rPr>
+          <w:rFonts w:ascii="Segoe UI" w:hAnsi="Segoe UI" w:eastAsia="Segoe UI"/>
+          <w:b w:val="0"/>
+          <w:color w:val="0B1739"/>
+          <w:sz w:val="18"/>
+        </w:rPr>
+        <w:t xml:space="preserve"> Pill Box has an exhibit in each evidence category and communicates weekly medication organization more clearly than Pill Pack. Its historical usage evidence is weak and must be refreshed. Reviewers may also conclude that the existing Pill emoji is sufficient. Even with those limitations, Pill Box is the strongest medication option in the current portfolio.</w:t>
       </w:r>
     </w:p>
     <w:p>
@@ -69,87 +280,9 @@
           <w:rFonts w:ascii="Segoe UI" w:hAnsi="Segoe UI" w:eastAsia="Segoe UI"/>
           <w:b w:val="0"/>
           <w:color w:val="0B1739"/>
-          <w:sz w:val="17"/>
+          <w:sz w:val="18"/>
         </w:rPr>
-        <w:t>Please identify the Microsoft standards, Windows/Segoe UI Emoji, design, and legal owners who can decide whether to:</w:t>
-      </w:r>
-    </w:p>
-    <w:p>
-      <w:pPr>
-        <w:pStyle w:val="CompactList"/>
-      </w:pPr>
-      <w:r>
-        <w:rPr>
-          <w:rFonts w:ascii="Segoe UI" w:hAnsi="Segoe UI" w:eastAsia="Segoe UI"/>
-          <w:b w:val="0"/>
-          <w:color w:val="0B1739"/>
-          <w:sz w:val="17"/>
-        </w:rPr>
-        <w:t xml:space="preserve">1.  advance </w:t>
-      </w:r>
-      <w:r>
-        <w:rPr>
-          <w:rFonts w:ascii="Segoe UI" w:hAnsi="Segoe UI" w:eastAsia="Segoe UI"/>
-          <w:b/>
-          <w:color w:val="0B1739"/>
-          <w:sz w:val="17"/>
-        </w:rPr>
-        <w:t>Ultrasound</w:t>
-      </w:r>
-      <w:r>
-        <w:rPr>
-          <w:rFonts w:ascii="Segoe UI" w:hAnsi="Segoe UI" w:eastAsia="Segoe UI"/>
-          <w:b w:val="0"/>
-          <w:color w:val="0B1739"/>
-          <w:sz w:val="17"/>
-        </w:rPr>
-        <w:t xml:space="preserve"> as the conditional 2026 lead;</w:t>
-      </w:r>
-    </w:p>
-    <w:p>
-      <w:pPr>
-        <w:pStyle w:val="CompactList"/>
-      </w:pPr>
-      <w:r>
-        <w:rPr>
-          <w:rFonts w:ascii="Segoe UI" w:hAnsi="Segoe UI" w:eastAsia="Segoe UI"/>
-          <w:b w:val="0"/>
-          <w:color w:val="0B1739"/>
-          <w:sz w:val="17"/>
-        </w:rPr>
-        <w:t xml:space="preserve">2.  retain </w:t>
-      </w:r>
-      <w:r>
-        <w:rPr>
-          <w:rFonts w:ascii="Segoe UI" w:hAnsi="Segoe UI" w:eastAsia="Segoe UI"/>
-          <w:b/>
-          <w:color w:val="0B1739"/>
-          <w:sz w:val="17"/>
-        </w:rPr>
-        <w:t>CT Scan</w:t>
-      </w:r>
-      <w:r>
-        <w:rPr>
-          <w:rFonts w:ascii="Segoe UI" w:hAnsi="Segoe UI" w:eastAsia="Segoe UI"/>
-          <w:b w:val="0"/>
-          <w:color w:val="0B1739"/>
-          <w:sz w:val="17"/>
-        </w:rPr>
-        <w:t xml:space="preserve"> as the operational fallback; and</w:t>
-      </w:r>
-    </w:p>
-    <w:p>
-      <w:pPr>
-        <w:pStyle w:val="CompactList"/>
-      </w:pPr>
-      <w:r>
-        <w:rPr>
-          <w:rFonts w:ascii="Segoe UI" w:hAnsi="Segoe UI" w:eastAsia="Segoe UI"/>
-          <w:b w:val="0"/>
-          <w:color w:val="0B1739"/>
-          <w:sz w:val="17"/>
-        </w:rPr>
-        <w:t>3.  authorize only the product, design, rights, and process statements those owners have expressly approved.</w:t>
+        <w:t>Before submitting, I will complete the evidence updates, current factor labels, artwork-ownership records, document metadata, and small-size recognition checks.</w:t>
       </w:r>
     </w:p>
     <w:p>
@@ -161,20 +294,24 @@
           <w:rFonts w:ascii="Segoe UI" w:hAnsi="Segoe UI" w:eastAsia="Segoe UI"/>
           <w:b w:val="0"/>
           <w:color w:val="0B1739"/>
-          <w:sz w:val="17"/>
+          <w:sz w:val="18"/>
         </w:rPr>
-        <w:t>Recommendation</w:t>
+        <w:t>Questions for Microsoft</w:t>
       </w:r>
     </w:p>
     <w:p>
+      <w:pPr>
+        <w:keepNext/>
+        <w:spacing w:before="60" w:after="30"/>
+      </w:pPr>
       <w:r>
         <w:rPr>
           <w:rFonts w:ascii="Segoe UI" w:hAnsi="Segoe UI" w:eastAsia="Segoe UI"/>
           <w:b/>
           <w:color w:val="0B1739"/>
-          <w:sz w:val="17"/>
+          <w:sz w:val="19"/>
         </w:rPr>
-        <w:t>Run a short pass/fail review of Ultrasound. If every gate below closes by the internal cutoff, advance it. If any gate remains open, complete the CT Scan refresh and use CT Scan as the fallback. File neither until its full packet passes final review.</w:t>
+        <w:t>1. Review and working-group timing</w:t>
       </w:r>
     </w:p>
     <w:p>
@@ -183,9 +320,9 @@
           <w:rFonts w:ascii="Segoe UI" w:hAnsi="Segoe UI" w:eastAsia="Segoe UI"/>
           <w:b w:val="0"/>
           <w:color w:val="0B1739"/>
-          <w:sz w:val="17"/>
+          <w:sz w:val="18"/>
         </w:rPr>
-        <w:t>Ultrasound has the strongest upside in the expanded slate. No matching concept was found in Unicode's public proposal-status record, its recent Google Books signal is approximately 1.70 times the required elephant comparator, and a monitor-plus-probe image can represent obstetric, cardiac, abdominal, bedside, procedure-guidance, education, and veterinary uses without depicting a patient or diagnosis.</w:t>
+        <w:t>After I submit the selected proposal PDFs through Unicode's official Emoji Submission Form, would Microsoft's Unicode standards representatives be willing to ask the Emoji Standard &amp; Research Working Group to consider adding them to an upcoming agenda as part of its normal review process?</w:t>
       </w:r>
     </w:p>
     <w:p>
@@ -194,9 +331,85 @@
           <w:rFonts w:ascii="Segoe UI" w:hAnsi="Segoe UI" w:eastAsia="Segoe UI"/>
           <w:b w:val="0"/>
           <w:color w:val="0B1739"/>
-          <w:sz w:val="17"/>
+          <w:sz w:val="18"/>
         </w:rPr>
-        <w:t>Ultrasound is not submission-ready today. It is missing four required Google screenshots, and the artwork still needs recognition review at 18 x 18 pixels and in black and white. CT Scan already contains all five required evidence categories, but its 2020 captures, current factor labels, and the submitter's explicit ownership warranty should be refreshed before filing.</w:t>
+        <w:t>Unicode will control the agenda, review, and outcome. I am asking for Microsoft's technical review and help bringing these proposals to the working group's attention.</w:t>
+      </w:r>
+    </w:p>
+    <w:p>
+      <w:pPr>
+        <w:keepNext/>
+        <w:spacing w:before="60" w:after="30"/>
+      </w:pPr>
+      <w:r>
+        <w:rPr>
+          <w:rFonts w:ascii="Segoe UI" w:hAnsi="Segoe UI" w:eastAsia="Segoe UI"/>
+          <w:b/>
+          <w:color w:val="0B1739"/>
+          <w:sz w:val="19"/>
+        </w:rPr>
+        <w:t>2. Separate UTC discussion document</w:t>
+      </w:r>
+    </w:p>
+    <w:p>
+      <w:r>
+        <w:rPr>
+          <w:rFonts w:ascii="Segoe UI" w:hAnsi="Segoe UI" w:eastAsia="Segoe UI"/>
+          <w:b w:val="0"/>
+          <w:color w:val="0B1739"/>
+          <w:sz w:val="18"/>
+        </w:rPr>
+        <w:t xml:space="preserve">Would Microsoft's standards team review the attached draft, </w:t>
+      </w:r>
+      <w:r>
+        <w:rPr>
+          <w:rFonts w:ascii="Segoe UI" w:hAnsi="Segoe UI" w:eastAsia="Segoe UI"/>
+          <w:b/>
+          <w:color w:val="0B1739"/>
+          <w:sz w:val="18"/>
+        </w:rPr>
+        <w:t>Health-related emoji coverage</w:t>
+      </w:r>
+      <w:r>
+        <w:rPr>
+          <w:rFonts w:ascii="Segoe UI" w:hAnsi="Segoe UI" w:eastAsia="Segoe UI"/>
+          <w:b w:val="0"/>
+          <w:color w:val="0B1739"/>
+          <w:sz w:val="18"/>
+        </w:rPr>
+        <w:t>, and, if it agrees that the question merits UTC discussion, help revise it for submission? Microsoft could submit a revised document, coauthor one with me, or use the draft as source material for its own document.</w:t>
+      </w:r>
+    </w:p>
+    <w:p>
+      <w:r>
+        <w:rPr>
+          <w:rFonts w:ascii="Segoe UI" w:hAnsi="Segoe UI" w:eastAsia="Segoe UI"/>
+          <w:b w:val="0"/>
+          <w:color w:val="0B1739"/>
+          <w:sz w:val="18"/>
+        </w:rPr>
+        <w:t>The draft raises a broader standards and discoverability question: whether closely related medical concepts would benefit from clearer guidance on substitutes, visual distinction, and expected usage. It is a discussion paper rather than a request to encode a group of emoji. Each candidate would still require its own submission through the official form.</w:t>
+      </w:r>
+    </w:p>
+    <w:p>
+      <w:r>
+        <w:rPr>
+          <w:rFonts w:ascii="Segoe UI" w:hAnsi="Segoe UI" w:eastAsia="Segoe UI"/>
+          <w:b w:val="0"/>
+          <w:color w:val="0B1739"/>
+          <w:sz w:val="18"/>
+        </w:rPr>
+        <w:t>If Unicode accepts a technical document into its public register, Unicode assigns the L2 number. The document may support discussion at the UTC or referral to a working group. It does not replace an individual emoji proposal or guarantee a decision.</w:t>
+      </w:r>
+    </w:p>
+    <w:p>
+      <w:r>
+        <w:rPr>
+          <w:rFonts w:ascii="Segoe UI" w:hAnsi="Segoe UI" w:eastAsia="Segoe UI"/>
+          <w:color w:val="0B1739"/>
+          <w:sz w:val="18"/>
+        </w:rPr>
+        <w:br w:type="page"/>
       </w:r>
     </w:p>
     <w:p>
@@ -208,9 +421,422 @@
           <w:rFonts w:ascii="Segoe UI" w:hAnsi="Segoe UI" w:eastAsia="Segoe UI"/>
           <w:b w:val="0"/>
           <w:color w:val="0B1739"/>
-          <w:sz w:val="17"/>
+          <w:sz w:val="18"/>
         </w:rPr>
-        <w:t>Pass/fail gate</w:t>
+        <w:t>Portfolio at a glance</w:t>
+      </w:r>
+    </w:p>
+    <w:tbl>
+      <w:tblPr>
+        <w:tblStyle w:val="TableGrid"/>
+        <w:tblW w:type="auto" w:w="0"/>
+        <w:tblLayout w:type="fixed"/>
+        <w:tblLook w:firstColumn="1" w:firstRow="1" w:lastColumn="0" w:lastRow="0" w:noHBand="0" w:noVBand="1" w:val="04A0"/>
+      </w:tblPr>
+      <w:tblGrid>
+        <w:gridCol w:w="3523"/>
+        <w:gridCol w:w="3523"/>
+        <w:gridCol w:w="3523"/>
+      </w:tblGrid>
+      <w:tr>
+        <w:tc>
+          <w:tcPr>
+            <w:tcW w:type="dxa" w:w="1944"/>
+            <w:shd w:val="clear" w:fill="0B1739"/>
+            <w:vAlign w:val="top"/>
+          </w:tcPr>
+          <w:p>
+            <w:pPr>
+              <w:spacing w:after="0"/>
+            </w:pPr>
+            <w:r>
+              <w:rPr>
+                <w:rFonts w:ascii="Segoe UI" w:hAnsi="Segoe UI" w:eastAsia="Segoe UI"/>
+                <w:b/>
+                <w:color w:val="FFFFFF"/>
+                <w:sz w:val="16"/>
+              </w:rPr>
+              <w:t>Position today</w:t>
+            </w:r>
+          </w:p>
+        </w:tc>
+        <w:tc>
+          <w:tcPr>
+            <w:tcW w:type="dxa" w:w="3096"/>
+            <w:shd w:val="clear" w:fill="0B1739"/>
+            <w:vAlign w:val="top"/>
+          </w:tcPr>
+          <w:p>
+            <w:pPr>
+              <w:spacing w:after="0"/>
+            </w:pPr>
+            <w:r>
+              <w:rPr>
+                <w:rFonts w:ascii="Segoe UI" w:hAnsi="Segoe UI" w:eastAsia="Segoe UI"/>
+                <w:b/>
+                <w:color w:val="FFFFFF"/>
+                <w:sz w:val="16"/>
+              </w:rPr>
+              <w:t>Concepts</w:t>
+            </w:r>
+          </w:p>
+        </w:tc>
+        <w:tc>
+          <w:tcPr>
+            <w:tcW w:type="dxa" w:w="5530"/>
+            <w:shd w:val="clear" w:fill="0B1739"/>
+            <w:vAlign w:val="top"/>
+          </w:tcPr>
+          <w:p>
+            <w:pPr>
+              <w:spacing w:after="0"/>
+            </w:pPr>
+            <w:r>
+              <w:rPr>
+                <w:rFonts w:ascii="Segoe UI" w:hAnsi="Segoe UI" w:eastAsia="Segoe UI"/>
+                <w:b/>
+                <w:color w:val="FFFFFF"/>
+                <w:sz w:val="16"/>
+              </w:rPr>
+              <w:t>Reason</w:t>
+            </w:r>
+          </w:p>
+        </w:tc>
+      </w:tr>
+      <w:tr>
+        <w:tc>
+          <w:tcPr>
+            <w:tcW w:type="dxa" w:w="1944"/>
+            <w:vAlign w:val="top"/>
+          </w:tcPr>
+          <w:p>
+            <w:pPr>
+              <w:spacing w:after="0"/>
+            </w:pPr>
+            <w:r>
+              <w:rPr>
+                <w:rFonts w:ascii="Segoe UI" w:hAnsi="Segoe UI" w:eastAsia="Segoe UI"/>
+                <w:b w:val="0"/>
+                <w:color w:val="0B1739"/>
+                <w:sz w:val="16"/>
+              </w:rPr>
+              <w:t>Planned filings after revision</w:t>
+            </w:r>
+          </w:p>
+        </w:tc>
+        <w:tc>
+          <w:tcPr>
+            <w:tcW w:type="dxa" w:w="3096"/>
+            <w:vAlign w:val="top"/>
+          </w:tcPr>
+          <w:p>
+            <w:pPr>
+              <w:spacing w:after="0"/>
+            </w:pPr>
+            <w:r>
+              <w:rPr>
+                <w:rFonts w:ascii="Segoe UI" w:hAnsi="Segoe UI" w:eastAsia="Segoe UI"/>
+                <w:b w:val="0"/>
+                <w:color w:val="0B1739"/>
+                <w:sz w:val="16"/>
+              </w:rPr>
+              <w:t>CT Scan; Blood Bag</w:t>
+            </w:r>
+          </w:p>
+        </w:tc>
+        <w:tc>
+          <w:tcPr>
+            <w:tcW w:type="dxa" w:w="5530"/>
+            <w:vAlign w:val="top"/>
+          </w:tcPr>
+          <w:p>
+            <w:pPr>
+              <w:spacing w:after="0"/>
+            </w:pPr>
+            <w:r>
+              <w:rPr>
+                <w:rFonts w:ascii="Segoe UI" w:hAnsi="Segoe UI" w:eastAsia="Segoe UI"/>
+                <w:b w:val="0"/>
+                <w:color w:val="0B1739"/>
+                <w:sz w:val="16"/>
+              </w:rPr>
+              <w:t>All five evidence categories are present; both still need current-method evidence, rights, and design review</w:t>
+            </w:r>
+          </w:p>
+        </w:tc>
+      </w:tr>
+      <w:tr>
+        <w:tc>
+          <w:tcPr>
+            <w:tcW w:type="dxa" w:w="1944"/>
+            <w:shd w:val="clear" w:fill="F3F6FB"/>
+            <w:vAlign w:val="top"/>
+          </w:tcPr>
+          <w:p>
+            <w:pPr>
+              <w:spacing w:after="0"/>
+            </w:pPr>
+            <w:r>
+              <w:rPr>
+                <w:rFonts w:ascii="Segoe UI" w:hAnsi="Segoe UI" w:eastAsia="Segoe UI"/>
+                <w:b w:val="0"/>
+                <w:color w:val="0B1739"/>
+                <w:sz w:val="16"/>
+              </w:rPr>
+              <w:t>First alternate</w:t>
+            </w:r>
+          </w:p>
+        </w:tc>
+        <w:tc>
+          <w:tcPr>
+            <w:tcW w:type="dxa" w:w="3096"/>
+            <w:shd w:val="clear" w:fill="F3F6FB"/>
+            <w:vAlign w:val="top"/>
+          </w:tcPr>
+          <w:p>
+            <w:pPr>
+              <w:spacing w:after="0"/>
+            </w:pPr>
+            <w:r>
+              <w:rPr>
+                <w:rFonts w:ascii="Segoe UI" w:hAnsi="Segoe UI" w:eastAsia="Segoe UI"/>
+                <w:b w:val="0"/>
+                <w:color w:val="0B1739"/>
+                <w:sz w:val="16"/>
+              </w:rPr>
+              <w:t>Pill Box</w:t>
+            </w:r>
+          </w:p>
+        </w:tc>
+        <w:tc>
+          <w:tcPr>
+            <w:tcW w:type="dxa" w:w="5530"/>
+            <w:shd w:val="clear" w:fill="F3F6FB"/>
+            <w:vAlign w:val="top"/>
+          </w:tcPr>
+          <w:p>
+            <w:pPr>
+              <w:spacing w:after="0"/>
+            </w:pPr>
+            <w:r>
+              <w:rPr>
+                <w:rFonts w:ascii="Segoe UI" w:hAnsi="Segoe UI" w:eastAsia="Segoe UI"/>
+                <w:b w:val="0"/>
+                <w:color w:val="0B1739"/>
+                <w:sz w:val="16"/>
+              </w:rPr>
+              <w:t>Complete evidence categories; clearer weekly medication use than Pill Pack, but weak usage and overlap with Pill remain</w:t>
+            </w:r>
+          </w:p>
+        </w:tc>
+      </w:tr>
+      <w:tr>
+        <w:tc>
+          <w:tcPr>
+            <w:tcW w:type="dxa" w:w="1944"/>
+            <w:vAlign w:val="top"/>
+          </w:tcPr>
+          <w:p>
+            <w:pPr>
+              <w:spacing w:after="0"/>
+            </w:pPr>
+            <w:r>
+              <w:rPr>
+                <w:rFonts w:ascii="Segoe UI" w:hAnsi="Segoe UI" w:eastAsia="Segoe UI"/>
+                <w:b w:val="0"/>
+                <w:color w:val="0B1739"/>
+                <w:sz w:val="16"/>
+              </w:rPr>
+              <w:t>Promising if evidence is completed</w:t>
+            </w:r>
+          </w:p>
+        </w:tc>
+        <w:tc>
+          <w:tcPr>
+            <w:tcW w:type="dxa" w:w="3096"/>
+            <w:vAlign w:val="top"/>
+          </w:tcPr>
+          <w:p>
+            <w:pPr>
+              <w:spacing w:after="0"/>
+            </w:pPr>
+            <w:r>
+              <w:rPr>
+                <w:rFonts w:ascii="Segoe UI" w:hAnsi="Segoe UI" w:eastAsia="Segoe UI"/>
+                <w:b w:val="0"/>
+                <w:color w:val="0B1739"/>
+                <w:sz w:val="16"/>
+              </w:rPr>
+              <w:t>Ultrasound; Weight Scale</w:t>
+            </w:r>
+          </w:p>
+        </w:tc>
+        <w:tc>
+          <w:tcPr>
+            <w:tcW w:type="dxa" w:w="5530"/>
+            <w:vAlign w:val="top"/>
+          </w:tcPr>
+          <w:p>
+            <w:pPr>
+              <w:spacing w:after="0"/>
+            </w:pPr>
+            <w:r>
+              <w:rPr>
+                <w:rFonts w:ascii="Segoe UI" w:hAnsi="Segoe UI" w:eastAsia="Segoe UI"/>
+                <w:b w:val="0"/>
+                <w:color w:val="0B1739"/>
+                <w:sz w:val="16"/>
+              </w:rPr>
+              <w:t>Broad uses and promising signals; required Trends or other Google evidence is missing</w:t>
+            </w:r>
+          </w:p>
+        </w:tc>
+      </w:tr>
+      <w:tr>
+        <w:tc>
+          <w:tcPr>
+            <w:tcW w:type="dxa" w:w="1944"/>
+            <w:shd w:val="clear" w:fill="F3F6FB"/>
+            <w:vAlign w:val="top"/>
+          </w:tcPr>
+          <w:p>
+            <w:pPr>
+              <w:spacing w:after="0"/>
+            </w:pPr>
+            <w:r>
+              <w:rPr>
+                <w:rFonts w:ascii="Segoe UI" w:hAnsi="Segoe UI" w:eastAsia="Segoe UI"/>
+                <w:b w:val="0"/>
+                <w:color w:val="0B1739"/>
+                <w:sz w:val="16"/>
+              </w:rPr>
+              <w:t>Other current-cycle drafts</w:t>
+            </w:r>
+          </w:p>
+        </w:tc>
+        <w:tc>
+          <w:tcPr>
+            <w:tcW w:type="dxa" w:w="3096"/>
+            <w:shd w:val="clear" w:fill="F3F6FB"/>
+            <w:vAlign w:val="top"/>
+          </w:tcPr>
+          <w:p>
+            <w:pPr>
+              <w:spacing w:after="0"/>
+            </w:pPr>
+            <w:r>
+              <w:rPr>
+                <w:rFonts w:ascii="Segoe UI" w:hAnsi="Segoe UI" w:eastAsia="Segoe UI"/>
+                <w:b w:val="0"/>
+                <w:color w:val="0B1739"/>
+                <w:sz w:val="16"/>
+              </w:rPr>
+              <w:t>White Blood Cell; Inhaler; IV Bag; Leg Cast; Pill Pack; Maze; First Aid Kit</w:t>
+            </w:r>
+          </w:p>
+        </w:tc>
+        <w:tc>
+          <w:tcPr>
+            <w:tcW w:type="dxa" w:w="5530"/>
+            <w:shd w:val="clear" w:fill="F3F6FB"/>
+            <w:vAlign w:val="top"/>
+          </w:tcPr>
+          <w:p>
+            <w:pPr>
+              <w:spacing w:after="0"/>
+            </w:pPr>
+            <w:r>
+              <w:rPr>
+                <w:rFonts w:ascii="Segoe UI" w:hAnsi="Segoe UI" w:eastAsia="Segoe UI"/>
+                <w:b w:val="0"/>
+                <w:color w:val="0B1739"/>
+                <w:sz w:val="16"/>
+              </w:rPr>
+              <w:t>Each has an evidence gap, a recognition problem, prior declines, or overlap with an existing emoji or another proposal</w:t>
+            </w:r>
+          </w:p>
+        </w:tc>
+      </w:tr>
+      <w:tr>
+        <w:tc>
+          <w:tcPr>
+            <w:tcW w:type="dxa" w:w="1944"/>
+            <w:vAlign w:val="top"/>
+          </w:tcPr>
+          <w:p>
+            <w:pPr>
+              <w:spacing w:after="0"/>
+            </w:pPr>
+            <w:r>
+              <w:rPr>
+                <w:rFonts w:ascii="Segoe UI" w:hAnsi="Segoe UI" w:eastAsia="Segoe UI"/>
+                <w:b w:val="0"/>
+                <w:color w:val="0B1739"/>
+                <w:sz w:val="16"/>
+              </w:rPr>
+              <w:t>Later-cycle candidates</w:t>
+            </w:r>
+          </w:p>
+        </w:tc>
+        <w:tc>
+          <w:tcPr>
+            <w:tcW w:type="dxa" w:w="3096"/>
+            <w:vAlign w:val="top"/>
+          </w:tcPr>
+          <w:p>
+            <w:pPr>
+              <w:spacing w:after="0"/>
+            </w:pPr>
+            <w:r>
+              <w:rPr>
+                <w:rFonts w:ascii="Segoe UI" w:hAnsi="Segoe UI" w:eastAsia="Segoe UI"/>
+                <w:b w:val="0"/>
+                <w:color w:val="0B1739"/>
+                <w:sz w:val="16"/>
+              </w:rPr>
+              <w:t>Kidney; Stomach; Liver</w:t>
+            </w:r>
+          </w:p>
+        </w:tc>
+        <w:tc>
+          <w:tcPr>
+            <w:tcW w:type="dxa" w:w="5530"/>
+            <w:vAlign w:val="top"/>
+          </w:tcPr>
+          <w:p>
+            <w:pPr>
+              <w:spacing w:after="0"/>
+            </w:pPr>
+            <w:r>
+              <w:rPr>
+                <w:rFonts w:ascii="Segoe UI" w:hAnsi="Segoe UI" w:eastAsia="Segoe UI"/>
+                <w:b w:val="0"/>
+                <w:color w:val="0B1739"/>
+                <w:sz w:val="16"/>
+              </w:rPr>
+              <w:t>Their recorded November 4, 2022 decline notices fall within Unicode's four-year bar at the July 31, 2026 deadline</w:t>
+            </w:r>
+          </w:p>
+        </w:tc>
+      </w:tr>
+    </w:tbl>
+    <w:p>
+      <w:pPr>
+        <w:spacing w:after="0"/>
+      </w:pPr>
+    </w:p>
+    <w:p>
+      <w:pPr>
+        <w:pStyle w:val="Heading2"/>
+      </w:pPr>
+      <w:r>
+        <w:rPr>
+          <w:rFonts w:ascii="Segoe UI" w:hAnsi="Segoe UI" w:eastAsia="Segoe UI"/>
+          <w:b w:val="0"/>
+          <w:color w:val="0B1739"/>
+          <w:sz w:val="18"/>
+        </w:rPr>
+        <w:t>Why Pill Pack is not in the filing plan</w:t>
       </w:r>
     </w:p>
     <w:p>
@@ -219,85 +845,38 @@
           <w:rFonts w:ascii="Segoe UI" w:hAnsi="Segoe UI" w:eastAsia="Segoe UI"/>
           <w:b w:val="0"/>
           <w:color w:val="0B1739"/>
-          <w:sz w:val="17"/>
+          <w:sz w:val="18"/>
         </w:rPr>
-        <w:t>Ultrasound becomes the lead only when all four items are complete:</w:t>
+        <w:t xml:space="preserve">Pill Pack is available as a draft, but it is not equivalent to Pill Box in readiness. It is missing Web Trends evidence, its Image Trends comparison uses the wrong comparator, and its 18-pixel image can resemble a keypad or remote. The name also risks confusion with the PillPack pharmacy brand. If the concept is revisited, </w:t>
       </w:r>
-    </w:p>
-    <w:p>
-      <w:pPr>
-        <w:pStyle w:val="CompactList"/>
-      </w:pPr>
+      <w:r>
+        <w:rPr>
+          <w:rFonts w:ascii="Segoe UI" w:hAnsi="Segoe UI" w:eastAsia="Segoe UI"/>
+          <w:b/>
+          <w:color w:val="0B1739"/>
+          <w:sz w:val="18"/>
+        </w:rPr>
+        <w:t>Blister Pack</w:t>
+      </w:r>
       <w:r>
         <w:rPr>
           <w:rFonts w:ascii="Segoe UI" w:hAnsi="Segoe UI" w:eastAsia="Segoe UI"/>
           <w:b w:val="0"/>
           <w:color w:val="0B1739"/>
-          <w:sz w:val="17"/>
+          <w:sz w:val="18"/>
         </w:rPr>
-        <w:t>•  Fresh Google Search and Google Video Search screenshots show a large, relevant result set.</w:t>
-      </w:r>
-    </w:p>
-    <w:p>
-      <w:pPr>
-        <w:pStyle w:val="CompactList"/>
-      </w:pPr>
-      <w:r>
-        <w:rPr>
-          <w:rFonts w:ascii="Segoe UI" w:hAnsi="Segoe UI" w:eastAsia="Segoe UI"/>
-          <w:b w:val="0"/>
-          <w:color w:val="0B1739"/>
-          <w:sz w:val="17"/>
-        </w:rPr>
-        <w:t>•  Worldwide Google Trends Web Search and Image Search comparisons against elephant show sustained usage.</w:t>
-      </w:r>
-    </w:p>
-    <w:p>
-      <w:pPr>
-        <w:pStyle w:val="CompactList"/>
-      </w:pPr>
-      <w:r>
-        <w:rPr>
-          <w:rFonts w:ascii="Segoe UI" w:hAnsi="Segoe UI" w:eastAsia="Segoe UI"/>
-          <w:b w:val="0"/>
-          <w:color w:val="0B1739"/>
-          <w:sz w:val="17"/>
-        </w:rPr>
-        <w:t>•  Microsoft design reviewers confirm that the probe remains recognizable at 18 x 18 pixels and that the monitor does not read as a generic computer.</w:t>
-      </w:r>
-    </w:p>
-    <w:p>
-      <w:pPr>
-        <w:pStyle w:val="CompactList"/>
-      </w:pPr>
-      <w:r>
-        <w:rPr>
-          <w:rFonts w:ascii="Segoe UI" w:hAnsi="Segoe UI" w:eastAsia="Segoe UI"/>
-          <w:b w:val="0"/>
-          <w:color w:val="0B1739"/>
-          <w:sz w:val="17"/>
-        </w:rPr>
-        <w:t>•  The product and legal owners clear the selected artwork, rights record, and any Microsoft-facing statement that will appear in the proposal.</w:t>
+        <w:t xml:space="preserve"> may be the clearer generic name.</w:t>
       </w:r>
     </w:p>
     <w:p>
       <w:r>
         <w:rPr>
           <w:rFonts w:ascii="Segoe UI" w:hAnsi="Segoe UI" w:eastAsia="Segoe UI"/>
-          <w:b/>
-          <w:color w:val="0B1739"/>
-          <w:sz w:val="17"/>
-        </w:rPr>
-        <w:t>Current evidence blocker:</w:t>
-      </w:r>
-      <w:r>
-        <w:rPr>
-          <w:rFonts w:ascii="Segoe UI" w:hAnsi="Segoe UI" w:eastAsia="Segoe UI"/>
           <w:b w:val="0"/>
           <w:color w:val="0B1739"/>
-          <w:sz w:val="17"/>
+          <w:sz w:val="18"/>
         </w:rPr>
-        <w:t xml:space="preserve"> on July 12, the available capture environment received HTTP 429 from Google Trends and a CAPTCHA from Google Search. No substitute screenshot should be presented as compliant evidence. The four captures require a clean manual session on an accepted network.</w:t>
+        <w:t>Filing both Pill Box and Pill Pack in the same intake would create an avoidable overlap question. The same applies to Blood Bag and IV Bag. The packet includes both pairs so Microsoft can compare them directly.</w:t>
       </w:r>
     </w:p>
     <w:p>
@@ -309,9 +888,9 @@
           <w:rFonts w:ascii="Segoe UI" w:hAnsi="Segoe UI" w:eastAsia="Segoe UI"/>
           <w:b w:val="0"/>
           <w:color w:val="0B1739"/>
-          <w:sz w:val="17"/>
+          <w:sz w:val="18"/>
         </w:rPr>
-        <w:t>Portfolio boundary</w:t>
+        <w:t>Relevant history</w:t>
       </w:r>
     </w:p>
     <w:p>
@@ -320,9 +899,9 @@
           <w:rFonts w:ascii="Segoe UI" w:hAnsi="Segoe UI" w:eastAsia="Segoe UI"/>
           <w:b w:val="0"/>
           <w:color w:val="0B1739"/>
-          <w:sz w:val="17"/>
+          <w:sz w:val="18"/>
         </w:rPr>
-        <w:t>Kidney, Stomach, and Liver were declined on November 4, 2022. Unicode's current guidance says that emoji declined within the last four years are not eligible for re-review. Because the 2026 intake closes July 31, these concepts should not be filed this cycle. The redesigned v1.7 artwork and proposals are review assets for a future eligible cycle, not 2026 submissions.</w:t>
+        <w:t>In 2018, Apple submitted L2/18-080, a proposal for nine accessibility emoji organized around four areas of accessibility. Apple described the set as a finite starting point, worked with disability organizations, and addressed Unicode's concern about open-ended categories. It is a useful example of a vendor explaining how related concepts fit together. Apple used the emoji-proposal process available in 2018; under the 2026 process, each encoding proposal must use the official form.</w:t>
       </w:r>
     </w:p>
     <w:p>
@@ -331,9 +910,20 @@
           <w:rFonts w:ascii="Segoe UI" w:hAnsi="Segoe UI" w:eastAsia="Segoe UI"/>
           <w:b w:val="0"/>
           <w:color w:val="0B1739"/>
-          <w:sz w:val="17"/>
+          <w:sz w:val="18"/>
         </w:rPr>
-        <w:t>Do not route the full portfolio as simultaneous proposals. One selected imaging concept gives Microsoft reviewers a bounded design and rights decision and reduces the open-ended-category risk.</w:t>
+        <w:t>In 2019, Christian Kamkoff, Shuhan He, and Melissa Thermidor submitted separate proposals for Anatomical Heart and Lungs. Unicode later encoded both characters. The 2026 candidates must still succeed on their own evidence, distinctiveness, rights, and expected usage.</w:t>
+      </w:r>
+    </w:p>
+    <w:p>
+      <w:r>
+        <w:rPr>
+          <w:rFonts w:ascii="Segoe UI" w:hAnsi="Segoe UI" w:eastAsia="Segoe UI"/>
+          <w:b w:val="0"/>
+          <w:color w:val="0B1739"/>
+          <w:sz w:val="18"/>
+        </w:rPr>
+        <w:t>The current 2026 process separates the two routes clearly: individual emoji proposals go through the Emoji Submission Form, while a broader technical discussion document follows Unicode's document-submission process.</w:t>
       </w:r>
     </w:p>
     <w:p>
@@ -345,79 +935,9 @@
           <w:rFonts w:ascii="Segoe UI" w:hAnsi="Segoe UI" w:eastAsia="Segoe UI"/>
           <w:b w:val="0"/>
           <w:color w:val="0B1739"/>
-          <w:sz w:val="17"/>
+          <w:sz w:val="18"/>
         </w:rPr>
-        <w:t>Microsoft role and guardrails</w:t>
-      </w:r>
-    </w:p>
-    <w:p>
-      <w:pPr>
-        <w:pStyle w:val="CompactList"/>
-      </w:pPr>
-      <w:r>
-        <w:rPr>
-          <w:rFonts w:ascii="Segoe UI" w:hAnsi="Segoe UI" w:eastAsia="Segoe UI"/>
-          <w:b w:val="0"/>
-          <w:color w:val="0B1739"/>
-          <w:sz w:val="17"/>
-        </w:rPr>
-        <w:t>•  Confirm the proper standards route and the responsible internal owners.</w:t>
-      </w:r>
-    </w:p>
-    <w:p>
-      <w:pPr>
-        <w:pStyle w:val="CompactList"/>
-      </w:pPr>
-      <w:r>
-        <w:rPr>
-          <w:rFonts w:ascii="Segoe UI" w:hAnsi="Segoe UI" w:eastAsia="Segoe UI"/>
-          <w:b w:val="0"/>
-          <w:color w:val="0B1739"/>
-          <w:sz w:val="17"/>
-        </w:rPr>
-        <w:t>•  Review technical recognizability, accessibility, image rights, and accurate product language.</w:t>
-      </w:r>
-    </w:p>
-    <w:p>
-      <w:pPr>
-        <w:pStyle w:val="CompactList"/>
-      </w:pPr>
-      <w:r>
-        <w:rPr>
-          <w:rFonts w:ascii="Segoe UI" w:hAnsi="Segoe UI" w:eastAsia="Segoe UI"/>
-          <w:b w:val="0"/>
-          <w:color w:val="0B1739"/>
-          <w:sz w:val="17"/>
-        </w:rPr>
-        <w:t>•  Keep Shuhan He as the sole preparer and individual submitter unless another person expressly agrees to authorship.</w:t>
-      </w:r>
-    </w:p>
-    <w:p>
-      <w:pPr>
-        <w:pStyle w:val="CompactList"/>
-      </w:pPr>
-      <w:r>
-        <w:rPr>
-          <w:rFonts w:ascii="Segoe UI" w:hAnsi="Segoe UI" w:eastAsia="Segoe UI"/>
-          <w:b w:val="0"/>
-          <w:color w:val="0B1739"/>
-          <w:sz w:val="17"/>
-        </w:rPr>
-        <w:t>•  Do not describe Microsoft as sponsoring, endorsing, or committing to implementation unless the responsible owners approve that exact statement in writing.</w:t>
-      </w:r>
-    </w:p>
-    <w:p>
-      <w:pPr>
-        <w:pStyle w:val="CompactList"/>
-      </w:pPr>
-      <w:r>
-        <w:rPr>
-          <w:rFonts w:ascii="Segoe UI" w:hAnsi="Segoe UI" w:eastAsia="Segoe UI"/>
-          <w:b w:val="0"/>
-          <w:color w:val="0B1739"/>
-          <w:sz w:val="17"/>
-        </w:rPr>
-        <w:t>•  Request ordinary Unicode technical review, never a preferred outcome.</w:t>
+        <w:t>Public sources</w:t>
       </w:r>
     </w:p>
     <w:p>
@@ -426,9 +946,9 @@
           <w:rFonts w:ascii="Segoe UI" w:hAnsi="Segoe UI" w:eastAsia="Segoe UI"/>
           <w:b w:val="0"/>
           <w:color w:val="0B1739"/>
-          <w:sz w:val="17"/>
+          <w:sz w:val="18"/>
         </w:rPr>
-        <w:t>Official Unicode proposal guidance, including the 2026 intake dates, evidence requirements, and four-year re-review rule:</w:t>
+        <w:t>Unicode emoji proposal guidance and 2026 filing window:</w:t>
       </w:r>
     </w:p>
     <w:p>
@@ -445,11 +965,136 @@
         </w:r>
       </w:hyperlink>
     </w:p>
+    <w:p>
+      <w:r>
+        <w:rPr>
+          <w:rFonts w:ascii="Segoe UI" w:hAnsi="Segoe UI" w:eastAsia="Segoe UI"/>
+          <w:b w:val="0"/>
+          <w:color w:val="0B1739"/>
+          <w:sz w:val="18"/>
+        </w:rPr>
+        <w:t>Unicode document-submission process:</w:t>
+      </w:r>
+    </w:p>
+    <w:p>
+      <w:pPr>
+        <w:spacing w:after="0"/>
+      </w:pPr>
+      <w:hyperlink r:id="rId12">
+        <w:r>
+          <w:rPr>
+            <w:color w:val="2563EB"/>
+            <w:u w:val="single"/>
+          </w:rPr>
+          <w:t>https://www.unicode.org/pending/docsubmit.html</w:t>
+        </w:r>
+      </w:hyperlink>
+    </w:p>
+    <w:p>
+      <w:r>
+        <w:rPr>
+          <w:rFonts w:ascii="Segoe UI" w:hAnsi="Segoe UI" w:eastAsia="Segoe UI"/>
+          <w:b w:val="0"/>
+          <w:color w:val="0B1739"/>
+          <w:sz w:val="18"/>
+        </w:rPr>
+        <w:t>Apple accessibility proposal, L2/18-080:</w:t>
+      </w:r>
+    </w:p>
+    <w:p>
+      <w:pPr>
+        <w:spacing w:after="0"/>
+      </w:pPr>
+      <w:hyperlink r:id="rId13">
+        <w:r>
+          <w:rPr>
+            <w:color w:val="2563EB"/>
+            <w:u w:val="single"/>
+          </w:rPr>
+          <w:t>https://www.unicode.org/L2/L2018/18080-accessibility-emoji.pdf</w:t>
+        </w:r>
+      </w:hyperlink>
+    </w:p>
+    <w:p>
+      <w:r>
+        <w:rPr>
+          <w:rFonts w:ascii="Segoe UI" w:hAnsi="Segoe UI" w:eastAsia="Segoe UI"/>
+          <w:b w:val="0"/>
+          <w:color w:val="0B1739"/>
+          <w:sz w:val="18"/>
+        </w:rPr>
+        <w:t>Anatomical Heart proposal, L2/19-150:</w:t>
+      </w:r>
+    </w:p>
+    <w:p>
+      <w:pPr>
+        <w:spacing w:after="0"/>
+      </w:pPr>
+      <w:hyperlink r:id="rId14">
+        <w:r>
+          <w:rPr>
+            <w:color w:val="2563EB"/>
+            <w:u w:val="single"/>
+          </w:rPr>
+          <w:t>https://www.unicode.org/L2/L2019/19150-heart-emoji.pdf</w:t>
+        </w:r>
+      </w:hyperlink>
+    </w:p>
+    <w:p>
+      <w:r>
+        <w:rPr>
+          <w:rFonts w:ascii="Segoe UI" w:hAnsi="Segoe UI" w:eastAsia="Segoe UI"/>
+          <w:b w:val="0"/>
+          <w:color w:val="0B1739"/>
+          <w:sz w:val="18"/>
+        </w:rPr>
+        <w:t>Lungs proposal, L2/19-149:</w:t>
+      </w:r>
+    </w:p>
+    <w:p>
+      <w:pPr>
+        <w:spacing w:after="0"/>
+      </w:pPr>
+      <w:hyperlink r:id="rId15">
+        <w:r>
+          <w:rPr>
+            <w:color w:val="2563EB"/>
+            <w:u w:val="single"/>
+          </w:rPr>
+          <w:t>https://www.unicode.org/L2/L2019/19149-lung-emoji.pdf</w:t>
+        </w:r>
+      </w:hyperlink>
+    </w:p>
+    <w:p>
+      <w:r>
+        <w:rPr>
+          <w:rFonts w:ascii="Segoe UI" w:hAnsi="Segoe UI" w:eastAsia="Segoe UI"/>
+          <w:b w:val="0"/>
+          <w:color w:val="0B1739"/>
+          <w:sz w:val="18"/>
+        </w:rPr>
+        <w:t>Working proposal PDFs for CT Scan, Blood Bag, and Pill Box:</w:t>
+      </w:r>
+    </w:p>
+    <w:p>
+      <w:pPr>
+        <w:spacing w:after="0"/>
+      </w:pPr>
+      <w:hyperlink r:id="rId16">
+        <w:r>
+          <w:rPr>
+            <w:color w:val="2563EB"/>
+            <w:u w:val="single"/>
+          </w:rPr>
+          <w:t>https://github.com/ShuhanCS/medicalemoji/tree/codex/eligible-2026-slate/submissions/v1.3.0</w:t>
+        </w:r>
+      </w:hyperlink>
+    </w:p>
     <w:sectPr>
       <w:headerReference w:type="default" r:id="rId9"/>
       <w:footerReference w:type="default" r:id="rId10"/>
       <w:pgSz w:w="12240" w:h="15840"/>
-      <w:pgMar w:top="605" w:right="720" w:bottom="605" w:left="720" w:header="259" w:footer="259" w:gutter="0"/>
+      <w:pgMar w:top="792" w:right="835" w:bottom="792" w:left="835" w:header="259" w:footer="259" w:gutter="0"/>
       <w:cols w:space="720"/>
       <w:docGrid w:linePitch="360"/>
     </w:sectPr>
@@ -470,7 +1115,7 @@
         <w:color w:val="667085"/>
         <w:sz w:val="14"/>
       </w:rPr>
-      <w:t>Prepared by Shuhan He  •  July 12, 2026  •  Internal review draft</w:t>
+      <w:t>Prepared by Shuhan He  |  July 13, 2026  |  Independent discussion material</w:t>
     </w:r>
   </w:p>
 </w:ftr>
@@ -490,7 +1135,7 @@
         <w:color w:val="2563EB"/>
         <w:sz w:val="14"/>
       </w:rPr>
-      <w:t>MEDICAL EMOJI  |  MICROSOFT INTERNAL REVIEW</w:t>
+      <w:t>MEDICAL EMOJI  |  MATERIALS FOR MICROSOFT REVIEW</w:t>
     </w:r>
   </w:p>
 </w:hdr>
@@ -865,7 +1510,7 @@
     <w:rPr>
       <w:rFonts w:ascii="Segoe UI" w:hAnsi="Segoe UI" w:eastAsia="Segoe UI"/>
       <w:color w:val="0B1739"/>
-      <w:sz w:val="17"/>
+      <w:sz w:val="18"/>
     </w:rPr>
   </w:style>
   <w:style w:type="paragraph" w:styleId="Header">
@@ -931,7 +1576,7 @@
       <w:b/>
       <w:bCs/>
       <w:color w:val="0B1739"/>
-      <w:sz w:val="39"/>
+      <w:sz w:val="41"/>
       <w:szCs w:val="28"/>
     </w:rPr>
   </w:style>
@@ -955,7 +1600,7 @@
       <w:b/>
       <w:bCs/>
       <w:color w:val="2563EB"/>
-      <w:sz w:val="22"/>
+      <w:sz w:val="24"/>
       <w:szCs w:val="26"/>
     </w:rPr>
   </w:style>
@@ -1222,7 +1867,7 @@
       <w:color w:val="0B1739"/>
       <w:spacing w:val="5"/>
       <w:kern w:val="28"/>
-      <w:sz w:val="39"/>
+      <w:sz w:val="41"/>
       <w:szCs w:val="52"/>
     </w:rPr>
   </w:style>
@@ -1396,8 +2041,15 @@
       <w:numPr>
         <w:numId w:val="1"/>
       </w:numPr>
+      <w:spacing w:after="30" w:line="240" w:lineRule="auto"/>
+      <w:ind w:left="317" w:hanging="187"/>
       <w:contextualSpacing/>
     </w:pPr>
+    <w:rPr>
+      <w:rFonts w:ascii="Segoe UI" w:hAnsi="Segoe UI" w:eastAsia="Segoe UI"/>
+      <w:color w:val="0B1739"/>
+      <w:sz w:val="17"/>
+    </w:rPr>
   </w:style>
   <w:style w:type="paragraph" w:styleId="ListBullet2">
     <w:name w:val="List Bullet 2"/>
@@ -1435,8 +2087,15 @@
       <w:numPr>
         <w:numId w:val="5"/>
       </w:numPr>
+      <w:spacing w:after="30" w:line="240" w:lineRule="auto"/>
+      <w:ind w:left="317" w:hanging="187"/>
       <w:contextualSpacing/>
     </w:pPr>
+    <w:rPr>
+      <w:rFonts w:ascii="Segoe UI" w:hAnsi="Segoe UI" w:eastAsia="Segoe UI"/>
+      <w:color w:val="0B1739"/>
+      <w:sz w:val="17"/>
+    </w:rPr>
   </w:style>
   <w:style w:type="paragraph" w:styleId="ListNumber2">
     <w:name w:val="List Number 2"/>
@@ -12551,18 +13210,6 @@
         <w:shd w:val="clear" w:color="auto" w:fill="FBCAA2" w:themeFill="accent6" w:themeFillTint="7F"/>
       </w:tcPr>
     </w:tblStylePr>
-  </w:style>
-  <w:style w:type="paragraph" w:customStyle="1" w:styleId="CompactList">
-    <w:name w:val="Compact List"/>
-    <w:pPr>
-      <w:spacing w:after="24" w:line="235" w:lineRule="auto"/>
-      <w:ind w:left="259" w:hanging="173"/>
-    </w:pPr>
-    <w:rPr>
-      <w:rFonts w:ascii="Segoe UI" w:hAnsi="Segoe UI"/>
-      <w:color w:val="0B1739"/>
-      <w:sz w:val="16"/>
-    </w:rPr>
   </w:style>
 </w:styles>
 </file>

</xml_diff>

<commit_message>
docs: finalize health coverage UTC submission
</commit_message>
<xml_diff>
--- a/output/doc/2026-07-12-microsoft-medical-emoji-decision-brief.docx
+++ b/output/doc/2026-07-12-microsoft-medical-emoji-decision-brief.docx
@@ -42,41 +42,7 @@
                 <w:color w:val="667085"/>
                 <w:sz w:val="15"/>
               </w:rPr>
-              <w:t>Prepared: July 13, 2026</w:t>
-            </w:r>
-            <w:r>
-              <w:rPr>
-                <w:rFonts w:ascii="Segoe UI" w:hAnsi="Segoe UI" w:eastAsia="Segoe UI"/>
-                <w:color w:val="667085"/>
-                <w:sz w:val="15"/>
-              </w:rPr>
-              <w:br/>
-            </w:r>
-            <w:r>
-              <w:rPr>
-                <w:rFonts w:ascii="Segoe UI" w:hAnsi="Segoe UI" w:eastAsia="Segoe UI"/>
-                <w:b w:val="0"/>
-                <w:color w:val="667085"/>
-                <w:sz w:val="15"/>
-              </w:rPr>
-              <w:t>Prepared by: Shuhan He</w:t>
-            </w:r>
-            <w:r>
-              <w:rPr>
-                <w:rFonts w:ascii="Segoe UI" w:hAnsi="Segoe UI" w:eastAsia="Segoe UI"/>
-                <w:color w:val="667085"/>
-                <w:sz w:val="15"/>
-              </w:rPr>
-              <w:br/>
-            </w:r>
-            <w:r>
-              <w:rPr>
-                <w:rFonts w:ascii="Segoe UI" w:hAnsi="Segoe UI" w:eastAsia="Segoe UI"/>
-                <w:b w:val="0"/>
-                <w:color w:val="667085"/>
-                <w:sz w:val="15"/>
-              </w:rPr>
-              <w:t>Status: Prepared independently for discussion. Microsoft has not endorsed these proposals or committed to implement them.</w:t>
+              <w:t>Prepared: July 13, 2026 | Prepared by: Shuhan He</w:t>
             </w:r>
           </w:p>
         </w:tc>
@@ -359,7 +325,7 @@
           <w:color w:val="0B1739"/>
           <w:sz w:val="18"/>
         </w:rPr>
-        <w:t xml:space="preserve">Would Microsoft's standards team review the attached draft, </w:t>
+        <w:t xml:space="preserve">The attached </w:t>
       </w:r>
       <w:r>
         <w:rPr>
@@ -377,7 +343,7 @@
           <w:color w:val="0B1739"/>
           <w:sz w:val="18"/>
         </w:rPr>
-        <w:t>, and, if it agrees that the question merits UTC discussion, help revise it for submission? Microsoft could submit a revised document, coauthor one with me, or use the draft as source material for its own document.</w:t>
+        <w:t xml:space="preserve"> paper is now written as a final UTC submission document and names David Rhew, Heena Purohit, and Shuhan He as authors. Would David and Heena confirm the text and their public authorship? If they do, could Microsoft's standards team ask the current UTC delegate to route or introduce the paper through the normal member process?</w:t>
       </w:r>
     </w:p>
     <w:p>
@@ -388,7 +354,7 @@
           <w:color w:val="0B1739"/>
           <w:sz w:val="18"/>
         </w:rPr>
-        <w:t>The draft raises a broader standards and discoverability question: whether closely related medical concepts would benefit from clearer guidance on substitutes, visual distinction, and expected usage. It is a discussion paper rather than a request to encode a group of emoji. Each candidate would still require its own submission through the official form.</w:t>
+        <w:t>The paper raises a broader standards and discoverability question: whether closely related medical concepts would benefit from clearer guidance on substitutes, visual distinction, and expected usage. It asks the UTC to refer the question to ESR for review and recommendation. It does not request the encoding of a group of emoji. Each candidate would still require its own submission through the official form.</w:t>
       </w:r>
     </w:p>
     <w:p>
@@ -399,7 +365,7 @@
           <w:color w:val="0B1739"/>
           <w:sz w:val="18"/>
         </w:rPr>
-        <w:t>If Unicode accepts a technical document into its public register, Unicode assigns the L2 number. The document may support discussion at the UTC or referral to a working group. It does not replace an individual emoji proposal or guarantee a decision.</w:t>
+        <w:t>Unicode assigns the official L2 number after accepting a technical document into its public register. The final PDF should therefore be submitted without an L2/26-nnn placeholder. The document may support UTC discussion or referral to a working group; it does not replace an individual emoji proposal or guarantee a decision.</w:t>
       </w:r>
     </w:p>
     <w:p>

</xml_diff>